<commit_message>
Validierung reines CO2: Vergleichsbild mit vier Stoffmodellen, in Doku ergaenzt
Co-Authored-By: Claude Opus 5.5 <noreply@anthropic.com>
Claude-Session: https://claude.ai/code/session_01FLRXDCKem3dbasHw8H8HkL
</commit_message>
<xml_diff>
--- a/Masterarbeit/Einspeicherung/Dokumentation_Stoffmodelle_Validierung.docx
+++ b/Masterarbeit/Einspeicherung/Dokumentation_Stoffmodelle_Validierung.docx
@@ -9416,7 +9416,7 @@
       </w:tr>
     </w:tbl>
     <w:bookmarkEnd w:id="34"/>
-    <w:bookmarkStart w:id="43" w:name="validierung-durch-modellvergleich"/>
+    <w:bookmarkStart w:id="47" w:name="validierung-durch-modellvergleich"/>
     <w:p>
       <w:pPr>
         <w:pStyle w:val="Heading1"/>
@@ -9969,7 +9969,7 @@
       </w:r>
     </w:p>
     <w:bookmarkEnd w:id="35"/>
-    <w:bookmarkStart w:id="36" w:name="ergebnis-reines-co₂-dampfdruck-in-bar"/>
+    <w:bookmarkStart w:id="39" w:name="ergebnis-reines-co₂-im-bild"/>
     <w:p>
       <w:pPr>
         <w:pStyle w:val="Heading2"/>
@@ -9979,6 +9979,88 @@
           <w:rStyle w:val="SectionNumber"/>
         </w:rPr>
         <w:t xml:space="preserve">8.2</w:t>
+      </w:r>
+      <w:r>
+        <w:tab/>
+      </w:r>
+      <w:r>
+        <w:t xml:space="preserve">Ergebnis reines CO₂ im Bild</w:t>
+      </w:r>
+    </w:p>
+    <w:p>
+      <w:pPr>
+        <w:pStyle w:val="CaptionedFigure"/>
+      </w:pPr>
+      <w:r>
+        <w:drawing>
+          <wp:inline>
+            <wp:extent cx="5753100" cy="4123055"/>
+            <wp:effectExtent b="0" l="0" r="0" t="0"/>
+            <wp:docPr descr="Abbildung 2: Reines CO₂ – CoolProp (Span-Wagner) im Vergleich mit GERG-2008, Peng-Robinson und SRK: a) Dampfdrucklinie, b) Abweichung Dampfdruck, c) Dichte auf der 15-°C-Isotherme, d) Abweichung Dichte (Skript 02_validierung_stoffmodelle.py)" title="" id="37" name="Picture"/>
+            <a:graphic>
+              <a:graphicData uri="http://schemas.openxmlformats.org/drawingml/2006/picture">
+                <pic:pic>
+                  <pic:nvPicPr>
+                    <pic:cNvPr descr="abb_validierung_rein_co2.png" id="38" name="Picture"/>
+                    <pic:cNvPicPr>
+                      <a:picLocks noChangeArrowheads="1" noChangeAspect="1"/>
+                    </pic:cNvPicPr>
+                  </pic:nvPicPr>
+                  <pic:blipFill>
+                    <a:blip r:embed="rId36"/>
+                    <a:stretch>
+                      <a:fillRect/>
+                    </a:stretch>
+                  </pic:blipFill>
+                  <pic:spPr bwMode="auto">
+                    <a:xfrm>
+                      <a:off x="0" y="0"/>
+                      <a:ext cx="5753100" cy="4123055"/>
+                    </a:xfrm>
+                    <a:prstGeom prst="rect">
+                      <a:avLst/>
+                    </a:prstGeom>
+                    <a:noFill/>
+                    <a:ln w="9525">
+                      <a:noFill/>
+                      <a:headEnd/>
+                      <a:tailEnd/>
+                    </a:ln>
+                  </pic:spPr>
+                </pic:pic>
+              </a:graphicData>
+            </a:graphic>
+          </wp:inline>
+        </w:drawing>
+      </w:r>
+    </w:p>
+    <w:p>
+      <w:pPr>
+        <w:pStyle w:val="ImageCaption"/>
+      </w:pPr>
+      <w:r>
+        <w:t xml:space="preserve">Abbildung 2: Reines CO₂ – CoolProp (Span-Wagner) im Vergleich mit GERG-2008, Peng-Robinson und SRK: a) Dampfdrucklinie, b) Abweichung Dampfdruck, c) Dichte auf der 15-°C-Isotherme, d) Abweichung Dichte (Skript 02_validierung_stoffmodelle.py)</w:t>
+      </w:r>
+    </w:p>
+    <w:p>
+      <w:pPr>
+        <w:pStyle w:val="BodyText"/>
+      </w:pPr>
+      <w:r>
+        <w:t xml:space="preserve">In a) und c) liegen CoolProp und GERG-2008 genau übereinander; b) und d) zeigen deshalb die Abweichung in Prozent. Beim Dampfdruck liegen auch die kubischen Gleichungen nahe (Peng-Robinson bis −1,3 %, SRK bis +0,7 %), weil sie am kritischen Punkt und am Dampfdruck angepasst sind. Bei der Dichte der flüssigen bzw. dichten Phase versagen sie dagegen: Bei 91 bar / 15 °C liegt Peng-Robinson 2,2 % und SRK 12,9 % zu tief. Für Pumpe, Gassäule und Kavernenkapazität ist genau diese Dichte entscheidend.</w:t>
+      </w:r>
+    </w:p>
+    <w:bookmarkEnd w:id="39"/>
+    <w:bookmarkStart w:id="40" w:name="ergebnis-reines-co₂-dampfdruck-in-bar"/>
+    <w:p>
+      <w:pPr>
+        <w:pStyle w:val="Heading2"/>
+      </w:pPr>
+      <w:r>
+        <w:rPr>
+          <w:rStyle w:val="SectionNumber"/>
+        </w:rPr>
+        <w:t xml:space="preserve">8.3</w:t>
       </w:r>
       <w:r>
         <w:tab/>
@@ -10471,8 +10553,8 @@
         </w:tc>
       </w:tr>
     </w:tbl>
-    <w:bookmarkEnd w:id="36"/>
-    <w:bookmarkStart w:id="37" w:name="X27969337894320828b51055190ba3f7a8450257"/>
+    <w:bookmarkEnd w:id="40"/>
+    <w:bookmarkStart w:id="41" w:name="X27969337894320828b51055190ba3f7a8450257"/>
     <w:p>
       <w:pPr>
         <w:pStyle w:val="Heading2"/>
@@ -10481,7 +10563,7 @@
         <w:rPr>
           <w:rStyle w:val="SectionNumber"/>
         </w:rPr>
-        <w:t xml:space="preserve">8.3</w:t>
+        <w:t xml:space="preserve">8.4</w:t>
       </w:r>
       <w:r>
         <w:tab/>
@@ -10963,8 +11045,8 @@
         <w:t xml:space="preserve">CoolProp und das originale GERG-2008 stimmen auf höchstens 0,02 % überein; die Berechnung ist damit verifiziert. Die kubischen Gleichungen liegen in der dichten Phase 2 bis 17 % daneben und wären für die Auslegung (Pumpe, Gassäule, Kavernenkapazität) nicht geeignet.</w:t>
       </w:r>
     </w:p>
-    <w:bookmarkEnd w:id="37"/>
-    <w:bookmarkStart w:id="41" w:name="ergebnis-gemisch-phasengrenze"/>
+    <w:bookmarkEnd w:id="41"/>
+    <w:bookmarkStart w:id="45" w:name="ergebnis-gemisch-phasengrenze"/>
     <w:p>
       <w:pPr>
         <w:pStyle w:val="Heading2"/>
@@ -10973,7 +11055,7 @@
         <w:rPr>
           <w:rStyle w:val="SectionNumber"/>
         </w:rPr>
-        <w:t xml:space="preserve">8.4</w:t>
+        <w:t xml:space="preserve">8.5</w:t>
       </w:r>
       <w:r>
         <w:tab/>
@@ -10991,18 +11073,18 @@
           <wp:inline>
             <wp:extent cx="5039999" cy="3677471"/>
             <wp:effectExtent b="0" l="0" r="0" t="0"/>
-            <wp:docPr descr="Abbildung 2: Phasengrenze des Worst-Case-Gemischs nach drei Stoffmodellen (Skript 02_validierung_stoffmodelle.py)" title="" id="39" name="Picture"/>
+            <wp:docPr descr="Abbildung 3: Phasengrenze des Worst-Case-Gemischs nach drei Stoffmodellen (Skript 02_validierung_stoffmodelle.py)" title="" id="43" name="Picture"/>
             <a:graphic>
               <a:graphicData uri="http://schemas.openxmlformats.org/drawingml/2006/picture">
                 <pic:pic>
                   <pic:nvPicPr>
-                    <pic:cNvPr descr="abb_validierung_phasengrenze.png" id="40" name="Picture"/>
+                    <pic:cNvPr descr="abb_validierung_phasengrenze.png" id="44" name="Picture"/>
                     <pic:cNvPicPr>
                       <a:picLocks noChangeArrowheads="1" noChangeAspect="1"/>
                     </pic:cNvPicPr>
                   </pic:nvPicPr>
                   <pic:blipFill>
-                    <a:blip r:embed="rId38"/>
+                    <a:blip r:embed="rId42"/>
                     <a:stretch>
                       <a:fillRect/>
                     </a:stretch>
@@ -11034,7 +11116,7 @@
         <w:pStyle w:val="ImageCaption"/>
       </w:pPr>
       <w:r>
-        <w:t xml:space="preserve">Abbildung 2: Phasengrenze des Worst-Case-Gemischs nach drei Stoffmodellen (Skript 02_validierung_stoffmodelle.py)</w:t>
+        <w:t xml:space="preserve">Abbildung 3: Phasengrenze des Worst-Case-Gemischs nach drei Stoffmodellen (Skript 02_validierung_stoffmodelle.py)</w:t>
       </w:r>
     </w:p>
     <w:tbl>
@@ -11283,8 +11365,8 @@
         </w:tc>
       </w:tr>
     </w:tbl>
-    <w:bookmarkEnd w:id="41"/>
-    <w:bookmarkStart w:id="42" w:name="X9b27e266cd0d562cc0cebf3b05f173f94c933ad"/>
+    <w:bookmarkEnd w:id="45"/>
+    <w:bookmarkStart w:id="46" w:name="X9b27e266cd0d562cc0cebf3b05f173f94c933ad"/>
     <w:p>
       <w:pPr>
         <w:pStyle w:val="Heading2"/>
@@ -11293,7 +11375,7 @@
         <w:rPr>
           <w:rStyle w:val="SectionNumber"/>
         </w:rPr>
-        <w:t xml:space="preserve">8.5</w:t>
+        <w:t xml:space="preserve">8.6</w:t>
       </w:r>
       <w:r>
         <w:tab/>
@@ -11651,9 +11733,9 @@
         <w:t xml:space="preserve">Das originale GERG-2008 bestätigt die CoolProp-Phasengrenze auf etwa 1 bar (Cricondenbar 83,2 statt 82,2 bar), die Dichten auf 0,2 %. Peng-Robinson liegt 1 bis 2 bar tiefer. Alle drei Modelle kommen zu denselben Aussagen für die Betriebspunkte. Die beiden Helmholtz-Modelle unterscheiden sich in den Reinstoffgleichungen und in den Paarparametern für CO₂–N₂, CO₂–Ar und CO₂–CO (CoolProp: EOS-CG, thermopack: GERG-2008). Die Abweichung von rund 1 bar ist damit ein Maß für die Modellunsicherheit, kein Programmfehler.</w:t>
       </w:r>
     </w:p>
-    <w:bookmarkEnd w:id="42"/>
-    <w:bookmarkEnd w:id="43"/>
-    <w:bookmarkStart w:id="47" w:name="unsicherheit-der-phasengrenze-3-bar"/>
+    <w:bookmarkEnd w:id="46"/>
+    <w:bookmarkEnd w:id="47"/>
+    <w:bookmarkStart w:id="51" w:name="unsicherheit-der-phasengrenze-3-bar"/>
     <w:p>
       <w:pPr>
         <w:pStyle w:val="Heading1"/>
@@ -11689,7 +11771,7 @@
         <w:t xml:space="preserve">Ein Betriebspunkt gilt nur dann als sicher ein- oder zweiphasig, wenn er mehr als 3 bar von der berechneten Phasengrenze entfernt ist.</w:t>
       </w:r>
     </w:p>
-    <w:bookmarkStart w:id="44" w:name="herleitung"/>
+    <w:bookmarkStart w:id="48" w:name="herleitung"/>
     <w:p>
       <w:pPr>
         <w:pStyle w:val="Heading2"/>
@@ -11767,8 +11849,8 @@
         <w:t xml:space="preserve">Die Summe beider Beiträge im ungünstigsten Fall ergibt 3,4 bar, eine quadratische Addition 2,6 bar. Gerundet werden ± 3 bar angesetzt. Für reines CO₂ ist die Unsicherheit viel kleiner (Dichte ± 0,03 bis ± 0,05 %, Dampfdruck im Vergleich ≤ 0,02 %) und für die Auslegung nicht maßgebend.</w:t>
       </w:r>
     </w:p>
-    <w:bookmarkEnd w:id="44"/>
-    <w:bookmarkStart w:id="45" w:name="auswirkung-auf-die-betriebspunkte"/>
+    <w:bookmarkEnd w:id="48"/>
+    <w:bookmarkStart w:id="49" w:name="auswirkung-auf-die-betriebspunkte"/>
     <w:p>
       <w:pPr>
         <w:pStyle w:val="Heading2"/>
@@ -11991,8 +12073,8 @@
         </w:tc>
       </w:tr>
     </w:tbl>
-    <w:bookmarkEnd w:id="45"/>
-    <w:bookmarkStart w:id="46" w:name="konsequenz-für-die-auslegung-s2"/>
+    <w:bookmarkEnd w:id="49"/>
+    <w:bookmarkStart w:id="50" w:name="konsequenz-für-die-auslegung-s2"/>
     <w:p>
       <w:pPr>
         <w:pStyle w:val="Heading2"/>
@@ -12050,9 +12132,9 @@
         <w:t xml:space="preserve">Die Wahl der Option und die Grenze von 3 bar sind Auslegungsentscheidungen und in der Arbeit zu begründen.</w:t>
       </w:r>
     </w:p>
-    <w:bookmarkEnd w:id="46"/>
-    <w:bookmarkEnd w:id="47"/>
-    <w:bookmarkStart w:id="48" w:name="grenzen-des-modells"/>
+    <w:bookmarkEnd w:id="50"/>
+    <w:bookmarkEnd w:id="51"/>
+    <w:bookmarkStart w:id="52" w:name="grenzen-des-modells"/>
     <w:p>
       <w:pPr>
         <w:pStyle w:val="Heading1"/>
@@ -12223,8 +12305,8 @@
         <w:t xml:space="preserve">Gerechnet wird ein Worst Case mit genau 5 % Begleitstoffen. Weniger Begleitstoffe verkleinern das Zweiphasengebiet in Richtung reines CO₂.</w:t>
       </w:r>
     </w:p>
-    <w:bookmarkEnd w:id="48"/>
-    <w:bookmarkStart w:id="49" w:name="offene-punkte"/>
+    <w:bookmarkEnd w:id="52"/>
+    <w:bookmarkStart w:id="53" w:name="offene-punkte"/>
     <w:p>
       <w:pPr>
         <w:pStyle w:val="Heading1"/>
@@ -12302,8 +12384,8 @@
         <w:t xml:space="preserve">Mindestabstand von 3 bar mit Uniper abstimmen.</w:t>
       </w:r>
     </w:p>
-    <w:bookmarkEnd w:id="49"/>
-    <w:bookmarkStart w:id="50" w:name="quellen"/>
+    <w:bookmarkEnd w:id="53"/>
+    <w:bookmarkStart w:id="54" w:name="quellen"/>
     <w:p>
       <w:pPr>
         <w:pStyle w:val="Heading1"/>
@@ -12573,7 +12655,7 @@
         <w:t xml:space="preserve">Michelsen, M. L. (1982): The isothermal flash problem. Part I. Stability. Fluid Phase Equilib. 9, 1–19. doi:10.1016/0378-3812(82)85001-2</w:t>
       </w:r>
     </w:p>
-    <w:bookmarkEnd w:id="50"/>
+    <w:bookmarkEnd w:id="54"/>
     <w:sectPr>
       <w:pgSz w:h="16838" w:w="11906"/>
       <w:pgMar w:bottom="1134" w:footer="708" w:gutter="0" w:header="708" w:left="1417" w:right="1417" w:top="1417"/>

</xml_diff>